<commit_message>
Add Journal functionality with dashboard, thesis entry form, and thesis view
- Implemented dashboard to display saved theses and statistics
- Created thesis entry form with validation and confidence slider
- Added functionality to save theses to local storage
- Developed thesis view to display detailed information of selected thesis
</commit_message>
<xml_diff>
--- a/Testing table.docx
+++ b/Testing table.docx
@@ -25,13 +25,13 @@
         <w:tblLook w:val="04A0" w:firstRow="1" w:lastRow="0" w:firstColumn="1" w:lastColumn="0" w:noHBand="0" w:noVBand="1"/>
       </w:tblPr>
       <w:tblGrid>
-        <w:gridCol w:w="1560"/>
-        <w:gridCol w:w="1701"/>
-        <w:gridCol w:w="1701"/>
-        <w:gridCol w:w="1984"/>
-        <w:gridCol w:w="1701"/>
-        <w:gridCol w:w="2367"/>
-        <w:gridCol w:w="2736"/>
+        <w:gridCol w:w="1332"/>
+        <w:gridCol w:w="1543"/>
+        <w:gridCol w:w="2346"/>
+        <w:gridCol w:w="1986"/>
+        <w:gridCol w:w="1347"/>
+        <w:gridCol w:w="2947"/>
+        <w:gridCol w:w="2249"/>
       </w:tblGrid>
       <w:tr>
         <w:tc>
@@ -295,6 +295,7 @@
           </w:tcPr>
           <w:p>
             <w:r>
+              <w:lastRenderedPageBreak/>
               <w:t>Enter New Thesis form</w:t>
             </w:r>
           </w:p>
@@ -315,11 +316,7 @@
           </w:tcPr>
           <w:p>
             <w:r>
-              <w:t xml:space="preserve">Interface should display an error message and </w:t>
-            </w:r>
-            <w:r>
-              <w:lastRenderedPageBreak/>
-              <w:t>stop me from being able to go through with this</w:t>
+              <w:t>Interface should display an error message and stop me from being able to go through with this</w:t>
             </w:r>
           </w:p>
         </w:tc>
@@ -329,7 +326,6 @@
           </w:tcPr>
           <w:p>
             <w:r>
-              <w:lastRenderedPageBreak/>
               <w:t xml:space="preserve">‘Please add a date message’ and form not submitting </w:t>
             </w:r>
           </w:p>
@@ -362,37 +358,524 @@
           <w:tcPr>
             <w:tcW w:w="1560" w:type="dxa"/>
           </w:tcPr>
-          <w:p/>
-        </w:tc>
-        <w:tc>
-          <w:tcPr>
-            <w:tcW w:w="1701" w:type="dxa"/>
-          </w:tcPr>
-          <w:p/>
-        </w:tc>
-        <w:tc>
-          <w:tcPr>
-            <w:tcW w:w="1701" w:type="dxa"/>
-          </w:tcPr>
+          <w:p>
+            <w:r>
+              <w:t>Enter New Thesis form</w:t>
+            </w:r>
+          </w:p>
+        </w:tc>
+        <w:tc>
+          <w:tcPr>
+            <w:tcW w:w="1701" w:type="dxa"/>
+          </w:tcPr>
+          <w:p>
+            <w:r>
+              <w:t>Trying to add stock tickers with special characters and numbers</w:t>
+            </w:r>
+          </w:p>
+        </w:tc>
+        <w:tc>
+          <w:tcPr>
+            <w:tcW w:w="1701" w:type="dxa"/>
+          </w:tcPr>
+          <w:p>
+            <w:r>
+              <w:rPr>
+                <w:noProof/>
+              </w:rPr>
+              <w:drawing>
+                <wp:anchor distT="0" distB="0" distL="114300" distR="114300" simplePos="0" relativeHeight="251659264" behindDoc="0" locked="0" layoutInCell="1" allowOverlap="1" wp14:anchorId="641B3B60" wp14:editId="72BD62D2">
+                  <wp:simplePos x="0" y="0"/>
+                  <wp:positionH relativeFrom="column">
+                    <wp:posOffset>-65171</wp:posOffset>
+                  </wp:positionH>
+                  <wp:positionV relativeFrom="paragraph">
+                    <wp:posOffset>1579346</wp:posOffset>
+                  </wp:positionV>
+                  <wp:extent cx="1347795" cy="1147011"/>
+                  <wp:effectExtent l="0" t="0" r="5080" b="0"/>
+                  <wp:wrapSquare wrapText="bothSides"/>
+                  <wp:docPr id="1611979400" name="Picture 1"/>
+                  <wp:cNvGraphicFramePr>
+                    <a:graphicFrameLocks xmlns:a="http://schemas.openxmlformats.org/drawingml/2006/main" noChangeAspect="1"/>
+                  </wp:cNvGraphicFramePr>
+                  <a:graphic xmlns:a="http://schemas.openxmlformats.org/drawingml/2006/main">
+                    <a:graphicData uri="http://schemas.openxmlformats.org/drawingml/2006/picture">
+                      <pic:pic xmlns:pic="http://schemas.openxmlformats.org/drawingml/2006/picture">
+                        <pic:nvPicPr>
+                          <pic:cNvPr id="1611979400" name=""/>
+                          <pic:cNvPicPr/>
+                        </pic:nvPicPr>
+                        <pic:blipFill>
+                          <a:blip r:embed="rId5"/>
+                          <a:stretch>
+                            <a:fillRect/>
+                          </a:stretch>
+                        </pic:blipFill>
+                        <pic:spPr>
+                          <a:xfrm>
+                            <a:off x="0" y="0"/>
+                            <a:ext cx="1347795" cy="1147011"/>
+                          </a:xfrm>
+                          <a:prstGeom prst="rect">
+                            <a:avLst/>
+                          </a:prstGeom>
+                        </pic:spPr>
+                      </pic:pic>
+                    </a:graphicData>
+                  </a:graphic>
+                  <wp14:sizeRelH relativeFrom="margin">
+                    <wp14:pctWidth>0</wp14:pctWidth>
+                  </wp14:sizeRelH>
+                  <wp14:sizeRelV relativeFrom="margin">
+                    <wp14:pctHeight>0</wp14:pctHeight>
+                  </wp14:sizeRelV>
+                </wp:anchor>
+              </w:drawing>
+            </w:r>
+            <w:r>
+              <w:t xml:space="preserve">Interface should </w:t>
+            </w:r>
+            <w:r>
+              <w:t>stop me entering the special characters while numbers are allowed because they are required sometimes in different exchanges.</w:t>
+            </w:r>
+          </w:p>
+          <w:p/>
           <w:p/>
         </w:tc>
         <w:tc>
           <w:tcPr>
             <w:tcW w:w="1984" w:type="dxa"/>
           </w:tcPr>
-          <w:p/>
-        </w:tc>
-        <w:tc>
-          <w:tcPr>
-            <w:tcW w:w="1701" w:type="dxa"/>
-          </w:tcPr>
-          <w:p/>
+          <w:p>
+            <w:r>
+              <w:rPr>
+                <w:noProof/>
+              </w:rPr>
+              <w:drawing>
+                <wp:anchor distT="0" distB="0" distL="114300" distR="114300" simplePos="0" relativeHeight="251663360" behindDoc="0" locked="0" layoutInCell="1" allowOverlap="1" wp14:anchorId="3E01EF42" wp14:editId="09E5A1C3">
+                  <wp:simplePos x="0" y="0"/>
+                  <wp:positionH relativeFrom="column">
+                    <wp:posOffset>-65304</wp:posOffset>
+                  </wp:positionH>
+                  <wp:positionV relativeFrom="paragraph">
+                    <wp:posOffset>1274980</wp:posOffset>
+                  </wp:positionV>
+                  <wp:extent cx="1122948" cy="443895"/>
+                  <wp:effectExtent l="0" t="0" r="1270" b="0"/>
+                  <wp:wrapSquare wrapText="bothSides"/>
+                  <wp:docPr id="712022321" name="Picture 1"/>
+                  <wp:cNvGraphicFramePr>
+                    <a:graphicFrameLocks xmlns:a="http://schemas.openxmlformats.org/drawingml/2006/main" noChangeAspect="1"/>
+                  </wp:cNvGraphicFramePr>
+                  <a:graphic xmlns:a="http://schemas.openxmlformats.org/drawingml/2006/main">
+                    <a:graphicData uri="http://schemas.openxmlformats.org/drawingml/2006/picture">
+                      <pic:pic xmlns:pic="http://schemas.openxmlformats.org/drawingml/2006/picture">
+                        <pic:nvPicPr>
+                          <pic:cNvPr id="712022321" name=""/>
+                          <pic:cNvPicPr/>
+                        </pic:nvPicPr>
+                        <pic:blipFill>
+                          <a:blip r:embed="rId6"/>
+                          <a:stretch>
+                            <a:fillRect/>
+                          </a:stretch>
+                        </pic:blipFill>
+                        <pic:spPr>
+                          <a:xfrm>
+                            <a:off x="0" y="0"/>
+                            <a:ext cx="1130302" cy="446802"/>
+                          </a:xfrm>
+                          <a:prstGeom prst="rect">
+                            <a:avLst/>
+                          </a:prstGeom>
+                        </pic:spPr>
+                      </pic:pic>
+                    </a:graphicData>
+                  </a:graphic>
+                  <wp14:sizeRelH relativeFrom="margin">
+                    <wp14:pctWidth>0</wp14:pctWidth>
+                  </wp14:sizeRelH>
+                  <wp14:sizeRelV relativeFrom="margin">
+                    <wp14:pctHeight>0</wp14:pctHeight>
+                  </wp14:sizeRelV>
+                </wp:anchor>
+              </w:drawing>
+            </w:r>
+            <w:r>
+              <w:rPr>
+                <w:noProof/>
+              </w:rPr>
+              <w:drawing>
+                <wp:anchor distT="0" distB="0" distL="114300" distR="114300" simplePos="0" relativeHeight="251661312" behindDoc="0" locked="0" layoutInCell="1" allowOverlap="1" wp14:anchorId="5B76E4CD" wp14:editId="1B5381AF">
+                  <wp:simplePos x="0" y="0"/>
+                  <wp:positionH relativeFrom="column">
+                    <wp:posOffset>-65372</wp:posOffset>
+                  </wp:positionH>
+                  <wp:positionV relativeFrom="paragraph">
+                    <wp:posOffset>53774</wp:posOffset>
+                  </wp:positionV>
+                  <wp:extent cx="1112150" cy="826169"/>
+                  <wp:effectExtent l="0" t="0" r="0" b="0"/>
+                  <wp:wrapSquare wrapText="bothSides"/>
+                  <wp:docPr id="1736593892" name="Picture 1"/>
+                  <wp:cNvGraphicFramePr>
+                    <a:graphicFrameLocks xmlns:a="http://schemas.openxmlformats.org/drawingml/2006/main" noChangeAspect="1"/>
+                  </wp:cNvGraphicFramePr>
+                  <a:graphic xmlns:a="http://schemas.openxmlformats.org/drawingml/2006/main">
+                    <a:graphicData uri="http://schemas.openxmlformats.org/drawingml/2006/picture">
+                      <pic:pic xmlns:pic="http://schemas.openxmlformats.org/drawingml/2006/picture">
+                        <pic:nvPicPr>
+                          <pic:cNvPr id="1736593892" name=""/>
+                          <pic:cNvPicPr/>
+                        </pic:nvPicPr>
+                        <pic:blipFill>
+                          <a:blip r:embed="rId7"/>
+                          <a:stretch>
+                            <a:fillRect/>
+                          </a:stretch>
+                        </pic:blipFill>
+                        <pic:spPr>
+                          <a:xfrm>
+                            <a:off x="0" y="0"/>
+                            <a:ext cx="1113211" cy="826957"/>
+                          </a:xfrm>
+                          <a:prstGeom prst="rect">
+                            <a:avLst/>
+                          </a:prstGeom>
+                        </pic:spPr>
+                      </pic:pic>
+                    </a:graphicData>
+                  </a:graphic>
+                  <wp14:sizeRelH relativeFrom="margin">
+                    <wp14:pctWidth>0</wp14:pctWidth>
+                  </wp14:sizeRelH>
+                  <wp14:sizeRelV relativeFrom="margin">
+                    <wp14:pctHeight>0</wp14:pctHeight>
+                  </wp14:sizeRelV>
+                </wp:anchor>
+              </w:drawing>
+            </w:r>
+          </w:p>
+        </w:tc>
+        <w:tc>
+          <w:tcPr>
+            <w:tcW w:w="1701" w:type="dxa"/>
+          </w:tcPr>
+          <w:p>
+            <w:r>
+              <w:t>Fail</w:t>
+            </w:r>
+          </w:p>
         </w:tc>
         <w:tc>
           <w:tcPr>
             <w:tcW w:w="2367" w:type="dxa"/>
           </w:tcPr>
-          <w:p/>
+          <w:p>
+            <w:r>
+              <w:t>Changes:</w:t>
+            </w:r>
+          </w:p>
+          <w:p/>
+          <w:p/>
+          <w:p/>
+          <w:p/>
+          <w:p>
+            <w:r>
+              <w:t>    if (!/^[A-Za-z0-9 .&amp;'-]+$/.test(</w:t>
+            </w:r>
+            <w:proofErr w:type="spellStart"/>
+            <w:r>
+              <w:t>thesis.stockName</w:t>
+            </w:r>
+            <w:proofErr w:type="spellEnd"/>
+            <w:r>
+              <w:t>)) {</w:t>
+            </w:r>
+          </w:p>
+          <w:p>
+            <w:r>
+              <w:t>    alert("Stock Name contains invalid characters.");</w:t>
+            </w:r>
+          </w:p>
+          <w:p>
+            <w:r>
+              <w:t>    return;</w:t>
+            </w:r>
+          </w:p>
+          <w:p>
+            <w:r>
+              <w:t>    }</w:t>
+            </w:r>
+          </w:p>
+          <w:p/>
+          <w:p>
+            <w:r>
+              <w:t>    if (!/^[A-Za-z0-9.-]+$/.test(</w:t>
+            </w:r>
+            <w:proofErr w:type="spellStart"/>
+            <w:r>
+              <w:t>thesis.ticker</w:t>
+            </w:r>
+            <w:proofErr w:type="spellEnd"/>
+            <w:r>
+              <w:t>)) {</w:t>
+            </w:r>
+          </w:p>
+          <w:p>
+            <w:r>
+              <w:t>        alert("Ticker Symbol contains invalid characters.");</w:t>
+            </w:r>
+          </w:p>
+          <w:p>
+            <w:r>
+              <w:t>        return;</w:t>
+            </w:r>
+          </w:p>
+          <w:p>
+            <w:r>
+              <w:t xml:space="preserve">    </w:t>
+            </w:r>
+          </w:p>
+          <w:p>
+            <w:r>
+              <w:t>    }</w:t>
+            </w:r>
+          </w:p>
+          <w:p/>
+          <w:p/>
+          <w:p/>
+          <w:p/>
+          <w:p/>
+          <w:p>
+            <w:r>
+              <w:t>/^[A-Za-z0-9 .&amp;'-]+$/</w:t>
+            </w:r>
+          </w:p>
+          <w:p>
+            <w:r>
+              <w:t>This means:</w:t>
+            </w:r>
+          </w:p>
+          <w:p>
+            <w:pPr>
+              <w:numPr>
+                <w:ilvl w:val="0"/>
+                <w:numId w:val="1"/>
+              </w:numPr>
+            </w:pPr>
+            <w:r>
+              <w:t xml:space="preserve">A-Z → uppercase letters </w:t>
+            </w:r>
+          </w:p>
+          <w:p>
+            <w:pPr>
+              <w:numPr>
+                <w:ilvl w:val="0"/>
+                <w:numId w:val="1"/>
+              </w:numPr>
+            </w:pPr>
+            <w:r>
+              <w:t xml:space="preserve">a-z → lowercase letters </w:t>
+            </w:r>
+          </w:p>
+          <w:p>
+            <w:pPr>
+              <w:numPr>
+                <w:ilvl w:val="0"/>
+                <w:numId w:val="1"/>
+              </w:numPr>
+            </w:pPr>
+            <w:r>
+              <w:t xml:space="preserve">0-9 → numbers </w:t>
+            </w:r>
+          </w:p>
+          <w:p>
+            <w:pPr>
+              <w:numPr>
+                <w:ilvl w:val="0"/>
+                <w:numId w:val="1"/>
+              </w:numPr>
+            </w:pPr>
+            <w:r>
+              <w:t xml:space="preserve">→ spaces </w:t>
+            </w:r>
+          </w:p>
+          <w:p>
+            <w:pPr>
+              <w:numPr>
+                <w:ilvl w:val="0"/>
+                <w:numId w:val="1"/>
+              </w:numPr>
+            </w:pPr>
+            <w:r>
+              <w:t xml:space="preserve">. → periods </w:t>
+            </w:r>
+          </w:p>
+          <w:p>
+            <w:pPr>
+              <w:numPr>
+                <w:ilvl w:val="0"/>
+                <w:numId w:val="1"/>
+              </w:numPr>
+            </w:pPr>
+            <w:r>
+              <w:t xml:space="preserve">&amp; → ampersands </w:t>
+            </w:r>
+          </w:p>
+          <w:p>
+            <w:pPr>
+              <w:numPr>
+                <w:ilvl w:val="0"/>
+                <w:numId w:val="1"/>
+              </w:numPr>
+            </w:pPr>
+            <w:r>
+              <w:t xml:space="preserve">' → apostrophes </w:t>
+            </w:r>
+          </w:p>
+          <w:p>
+            <w:pPr>
+              <w:numPr>
+                <w:ilvl w:val="0"/>
+                <w:numId w:val="1"/>
+              </w:numPr>
+            </w:pPr>
+            <w:r>
+              <w:t xml:space="preserve">- → hyphens </w:t>
+            </w:r>
+          </w:p>
+          <w:p>
+            <w:pPr>
+              <w:numPr>
+                <w:ilvl w:val="0"/>
+                <w:numId w:val="1"/>
+              </w:numPr>
+            </w:pPr>
+            <w:r>
+              <w:t>+ → one or more characters</w:t>
+            </w:r>
+          </w:p>
+          <w:p/>
+          <w:p>
+            <w:r>
+              <w:t>This checks to see if the stock name or ticker has special characters and then presents the error message if it does.</w:t>
+            </w:r>
+          </w:p>
+          <w:p/>
+          <w:p/>
+          <w:p>
+            <w:r>
+              <w:rPr>
+                <w:noProof/>
+              </w:rPr>
+              <w:lastRenderedPageBreak/>
+              <w:drawing>
+                <wp:anchor distT="0" distB="0" distL="114300" distR="114300" simplePos="0" relativeHeight="251667456" behindDoc="0" locked="0" layoutInCell="1" allowOverlap="1" wp14:anchorId="0869DC71" wp14:editId="136B67B9">
+                  <wp:simplePos x="0" y="0"/>
+                  <wp:positionH relativeFrom="column">
+                    <wp:posOffset>-37465</wp:posOffset>
+                  </wp:positionH>
+                  <wp:positionV relativeFrom="paragraph">
+                    <wp:posOffset>603250</wp:posOffset>
+                  </wp:positionV>
+                  <wp:extent cx="1008380" cy="1034415"/>
+                  <wp:effectExtent l="0" t="0" r="1270" b="0"/>
+                  <wp:wrapSquare wrapText="bothSides"/>
+                  <wp:docPr id="1275558361" name="Picture 1"/>
+                  <wp:cNvGraphicFramePr>
+                    <a:graphicFrameLocks xmlns:a="http://schemas.openxmlformats.org/drawingml/2006/main" noChangeAspect="1"/>
+                  </wp:cNvGraphicFramePr>
+                  <a:graphic xmlns:a="http://schemas.openxmlformats.org/drawingml/2006/main">
+                    <a:graphicData uri="http://schemas.openxmlformats.org/drawingml/2006/picture">
+                      <pic:pic xmlns:pic="http://schemas.openxmlformats.org/drawingml/2006/picture">
+                        <pic:nvPicPr>
+                          <pic:cNvPr id="1275558361" name=""/>
+                          <pic:cNvPicPr/>
+                        </pic:nvPicPr>
+                        <pic:blipFill>
+                          <a:blip r:embed="rId8"/>
+                          <a:stretch>
+                            <a:fillRect/>
+                          </a:stretch>
+                        </pic:blipFill>
+                        <pic:spPr>
+                          <a:xfrm>
+                            <a:off x="0" y="0"/>
+                            <a:ext cx="1008380" cy="1034415"/>
+                          </a:xfrm>
+                          <a:prstGeom prst="rect">
+                            <a:avLst/>
+                          </a:prstGeom>
+                        </pic:spPr>
+                      </pic:pic>
+                    </a:graphicData>
+                  </a:graphic>
+                  <wp14:sizeRelH relativeFrom="margin">
+                    <wp14:pctWidth>0</wp14:pctWidth>
+                  </wp14:sizeRelH>
+                  <wp14:sizeRelV relativeFrom="margin">
+                    <wp14:pctHeight>0</wp14:pctHeight>
+                  </wp14:sizeRelV>
+                </wp:anchor>
+              </w:drawing>
+            </w:r>
+            <w:r>
+              <w:rPr>
+                <w:noProof/>
+              </w:rPr>
+              <w:drawing>
+                <wp:anchor distT="0" distB="0" distL="114300" distR="114300" simplePos="0" relativeHeight="251665408" behindDoc="0" locked="0" layoutInCell="1" allowOverlap="1" wp14:anchorId="70759A23" wp14:editId="2DDD18FD">
+                  <wp:simplePos x="0" y="0"/>
+                  <wp:positionH relativeFrom="column">
+                    <wp:posOffset>-61595</wp:posOffset>
+                  </wp:positionH>
+                  <wp:positionV relativeFrom="paragraph">
+                    <wp:posOffset>33655</wp:posOffset>
+                  </wp:positionV>
+                  <wp:extent cx="1202690" cy="429895"/>
+                  <wp:effectExtent l="0" t="0" r="0" b="8255"/>
+                  <wp:wrapSquare wrapText="bothSides"/>
+                  <wp:docPr id="2108807364" name="Picture 1"/>
+                  <wp:cNvGraphicFramePr>
+                    <a:graphicFrameLocks xmlns:a="http://schemas.openxmlformats.org/drawingml/2006/main" noChangeAspect="1"/>
+                  </wp:cNvGraphicFramePr>
+                  <a:graphic xmlns:a="http://schemas.openxmlformats.org/drawingml/2006/main">
+                    <a:graphicData uri="http://schemas.openxmlformats.org/drawingml/2006/picture">
+                      <pic:pic xmlns:pic="http://schemas.openxmlformats.org/drawingml/2006/picture">
+                        <pic:nvPicPr>
+                          <pic:cNvPr id="2108807364" name=""/>
+                          <pic:cNvPicPr/>
+                        </pic:nvPicPr>
+                        <pic:blipFill>
+                          <a:blip r:embed="rId9"/>
+                          <a:stretch>
+                            <a:fillRect/>
+                          </a:stretch>
+                        </pic:blipFill>
+                        <pic:spPr>
+                          <a:xfrm>
+                            <a:off x="0" y="0"/>
+                            <a:ext cx="1202690" cy="429895"/>
+                          </a:xfrm>
+                          <a:prstGeom prst="rect">
+                            <a:avLst/>
+                          </a:prstGeom>
+                        </pic:spPr>
+                      </pic:pic>
+                    </a:graphicData>
+                  </a:graphic>
+                  <wp14:sizeRelH relativeFrom="margin">
+                    <wp14:pctWidth>0</wp14:pctWidth>
+                  </wp14:sizeRelH>
+                  <wp14:sizeRelV relativeFrom="margin">
+                    <wp14:pctHeight>0</wp14:pctHeight>
+                  </wp14:sizeRelV>
+                </wp:anchor>
+              </w:drawing>
+            </w:r>
+          </w:p>
         </w:tc>
         <w:tc>
           <w:tcPr>
@@ -710,6 +1193,57 @@
         </w:tc>
       </w:tr>
     </w:tbl>
+    <w:p/>
+    <w:p>
+      <w:pPr>
+        <w:rPr>
+          <w:sz w:val="32"/>
+          <w:szCs w:val="32"/>
+        </w:rPr>
+      </w:pPr>
+    </w:p>
+    <w:p/>
+    <w:p/>
+    <w:p>
+      <w:pPr>
+        <w:rPr>
+          <w:sz w:val="32"/>
+          <w:szCs w:val="32"/>
+        </w:rPr>
+      </w:pPr>
+      <w:r>
+        <w:rPr>
+          <w:sz w:val="32"/>
+          <w:szCs w:val="32"/>
+          <w:highlight w:val="yellow"/>
+        </w:rPr>
+        <w:t>Multiple Viewport width device testing:</w:t>
+      </w:r>
+    </w:p>
+    <w:p>
+      <w:pPr>
+        <w:rPr>
+          <w:sz w:val="32"/>
+          <w:szCs w:val="32"/>
+        </w:rPr>
+      </w:pPr>
+    </w:p>
+    <w:p>
+      <w:pPr>
+        <w:rPr>
+          <w:sz w:val="32"/>
+          <w:szCs w:val="32"/>
+        </w:rPr>
+      </w:pPr>
+    </w:p>
+    <w:p>
+      <w:pPr>
+        <w:rPr>
+          <w:sz w:val="32"/>
+          <w:szCs w:val="32"/>
+        </w:rPr>
+      </w:pPr>
+    </w:p>
     <w:p/>
     <w:sectPr>
       <w:pgSz w:w="16838" w:h="11906" w:orient="landscape"/>
@@ -719,6 +1253,315 @@
     </w:sectPr>
   </w:body>
 </w:document>
+</file>
+
+<file path=word/numbering.xml><?xml version="1.0" encoding="utf-8"?>
+<w:numbering xmlns:wpc="http://schemas.microsoft.com/office/word/2010/wordprocessingCanvas" xmlns:cx="http://schemas.microsoft.com/office/drawing/2014/chartex" xmlns:cx1="http://schemas.microsoft.com/office/drawing/2015/9/8/chartex" xmlns:cx2="http://schemas.microsoft.com/office/drawing/2015/10/21/chartex" xmlns:cx3="http://schemas.microsoft.com/office/drawing/2016/5/9/chartex" xmlns:cx4="http://schemas.microsoft.com/office/drawing/2016/5/10/chartex" xmlns:cx5="http://schemas.microsoft.com/office/drawing/2016/5/11/chartex" xmlns:cx6="http://schemas.microsoft.com/office/drawing/2016/5/12/chartex" xmlns:cx7="http://schemas.microsoft.com/office/drawing/2016/5/13/chartex" xmlns:cx8="http://schemas.microsoft.com/office/drawing/2016/5/14/chartex" xmlns:mc="http://schemas.openxmlformats.org/markup-compatibility/2006" xmlns:aink="http://schemas.microsoft.com/office/drawing/2016/ink" xmlns:am3d="http://schemas.microsoft.com/office/drawing/2017/model3d" xmlns:o="urn:schemas-microsoft-com:office:office" xmlns:oel="http://schemas.microsoft.com/office/2019/extlst" xmlns:r="http://schemas.openxmlformats.org/officeDocument/2006/relationships" xmlns:m="http://schemas.openxmlformats.org/officeDocument/2006/math" xmlns:v="urn:schemas-microsoft-com:vml" xmlns:wp14="http://schemas.microsoft.com/office/word/2010/wordprocessingDrawing" xmlns:wp="http://schemas.openxmlformats.org/drawingml/2006/wordprocessingDrawing" xmlns:w10="urn:schemas-microsoft-com:office:word" xmlns:w="http://schemas.openxmlformats.org/wordprocessingml/2006/main" xmlns:w14="http://schemas.microsoft.com/office/word/2010/wordml" xmlns:w15="http://schemas.microsoft.com/office/word/2012/wordml" xmlns:w16cei="http://schemas.microsoft.com/office/word/2026/wordml/cei" xmlns:w16cex="http://schemas.microsoft.com/office/word/2018/wordml/cex" xmlns:w16cid="http://schemas.microsoft.com/office/word/2016/wordml/cid" xmlns:w16="http://schemas.microsoft.com/office/word/2018/wordml" xmlns:w16du="http://schemas.microsoft.com/office/word/2023/wordml/word16du" xmlns:w16sdtdh="http://schemas.microsoft.com/office/word/2020/wordml/sdtdatahash" xmlns:w16sdtfl="http://schemas.microsoft.com/office/word/2024/wordml/sdtformatlock" xmlns:w16se="http://schemas.microsoft.com/office/word/2015/wordml/symex" xmlns:wpg="http://schemas.microsoft.com/office/word/2010/wordprocessingGroup" xmlns:wpi="http://schemas.microsoft.com/office/word/2010/wordprocessingInk" xmlns:wne="http://schemas.microsoft.com/office/word/2006/wordml" xmlns:wps="http://schemas.microsoft.com/office/word/2010/wordprocessingShape" mc:Ignorable="w14 w15 w16se w16cid w16 w16cex w16sdtdh w16sdtfl w16du wp14">
+  <w:abstractNum w:abstractNumId="0" w15:restartNumberingAfterBreak="0">
+    <w:nsid w:val="67922C7C"/>
+    <w:multiLevelType w:val="multilevel"/>
+    <w:tmpl w:val="B120BC76"/>
+    <w:lvl w:ilvl="0">
+      <w:start w:val="1"/>
+      <w:numFmt w:val="bullet"/>
+      <w:lvlText w:val=""/>
+      <w:lvlJc w:val="left"/>
+      <w:pPr>
+        <w:tabs>
+          <w:tab w:val="num" w:pos="720"/>
+        </w:tabs>
+        <w:ind w:left="720" w:hanging="360"/>
+      </w:pPr>
+      <w:rPr>
+        <w:rFonts w:ascii="Symbol" w:hAnsi="Symbol" w:hint="default"/>
+        <w:sz w:val="20"/>
+      </w:rPr>
+    </w:lvl>
+    <w:lvl w:ilvl="1" w:tentative="1">
+      <w:start w:val="1"/>
+      <w:numFmt w:val="bullet"/>
+      <w:lvlText w:val="o"/>
+      <w:lvlJc w:val="left"/>
+      <w:pPr>
+        <w:tabs>
+          <w:tab w:val="num" w:pos="1440"/>
+        </w:tabs>
+        <w:ind w:left="1440" w:hanging="360"/>
+      </w:pPr>
+      <w:rPr>
+        <w:rFonts w:ascii="Courier New" w:hAnsi="Courier New" w:hint="default"/>
+        <w:sz w:val="20"/>
+      </w:rPr>
+    </w:lvl>
+    <w:lvl w:ilvl="2" w:tentative="1">
+      <w:start w:val="1"/>
+      <w:numFmt w:val="bullet"/>
+      <w:lvlText w:val=""/>
+      <w:lvlJc w:val="left"/>
+      <w:pPr>
+        <w:tabs>
+          <w:tab w:val="num" w:pos="2160"/>
+        </w:tabs>
+        <w:ind w:left="2160" w:hanging="360"/>
+      </w:pPr>
+      <w:rPr>
+        <w:rFonts w:ascii="Wingdings" w:hAnsi="Wingdings" w:hint="default"/>
+        <w:sz w:val="20"/>
+      </w:rPr>
+    </w:lvl>
+    <w:lvl w:ilvl="3" w:tentative="1">
+      <w:start w:val="1"/>
+      <w:numFmt w:val="bullet"/>
+      <w:lvlText w:val=""/>
+      <w:lvlJc w:val="left"/>
+      <w:pPr>
+        <w:tabs>
+          <w:tab w:val="num" w:pos="2880"/>
+        </w:tabs>
+        <w:ind w:left="2880" w:hanging="360"/>
+      </w:pPr>
+      <w:rPr>
+        <w:rFonts w:ascii="Wingdings" w:hAnsi="Wingdings" w:hint="default"/>
+        <w:sz w:val="20"/>
+      </w:rPr>
+    </w:lvl>
+    <w:lvl w:ilvl="4" w:tentative="1">
+      <w:start w:val="1"/>
+      <w:numFmt w:val="bullet"/>
+      <w:lvlText w:val=""/>
+      <w:lvlJc w:val="left"/>
+      <w:pPr>
+        <w:tabs>
+          <w:tab w:val="num" w:pos="3600"/>
+        </w:tabs>
+        <w:ind w:left="3600" w:hanging="360"/>
+      </w:pPr>
+      <w:rPr>
+        <w:rFonts w:ascii="Wingdings" w:hAnsi="Wingdings" w:hint="default"/>
+        <w:sz w:val="20"/>
+      </w:rPr>
+    </w:lvl>
+    <w:lvl w:ilvl="5" w:tentative="1">
+      <w:start w:val="1"/>
+      <w:numFmt w:val="bullet"/>
+      <w:lvlText w:val=""/>
+      <w:lvlJc w:val="left"/>
+      <w:pPr>
+        <w:tabs>
+          <w:tab w:val="num" w:pos="4320"/>
+        </w:tabs>
+        <w:ind w:left="4320" w:hanging="360"/>
+      </w:pPr>
+      <w:rPr>
+        <w:rFonts w:ascii="Wingdings" w:hAnsi="Wingdings" w:hint="default"/>
+        <w:sz w:val="20"/>
+      </w:rPr>
+    </w:lvl>
+    <w:lvl w:ilvl="6" w:tentative="1">
+      <w:start w:val="1"/>
+      <w:numFmt w:val="bullet"/>
+      <w:lvlText w:val=""/>
+      <w:lvlJc w:val="left"/>
+      <w:pPr>
+        <w:tabs>
+          <w:tab w:val="num" w:pos="5040"/>
+        </w:tabs>
+        <w:ind w:left="5040" w:hanging="360"/>
+      </w:pPr>
+      <w:rPr>
+        <w:rFonts w:ascii="Wingdings" w:hAnsi="Wingdings" w:hint="default"/>
+        <w:sz w:val="20"/>
+      </w:rPr>
+    </w:lvl>
+    <w:lvl w:ilvl="7" w:tentative="1">
+      <w:start w:val="1"/>
+      <w:numFmt w:val="bullet"/>
+      <w:lvlText w:val=""/>
+      <w:lvlJc w:val="left"/>
+      <w:pPr>
+        <w:tabs>
+          <w:tab w:val="num" w:pos="5760"/>
+        </w:tabs>
+        <w:ind w:left="5760" w:hanging="360"/>
+      </w:pPr>
+      <w:rPr>
+        <w:rFonts w:ascii="Wingdings" w:hAnsi="Wingdings" w:hint="default"/>
+        <w:sz w:val="20"/>
+      </w:rPr>
+    </w:lvl>
+    <w:lvl w:ilvl="8" w:tentative="1">
+      <w:start w:val="1"/>
+      <w:numFmt w:val="bullet"/>
+      <w:lvlText w:val=""/>
+      <w:lvlJc w:val="left"/>
+      <w:pPr>
+        <w:tabs>
+          <w:tab w:val="num" w:pos="6480"/>
+        </w:tabs>
+        <w:ind w:left="6480" w:hanging="360"/>
+      </w:pPr>
+      <w:rPr>
+        <w:rFonts w:ascii="Wingdings" w:hAnsi="Wingdings" w:hint="default"/>
+        <w:sz w:val="20"/>
+      </w:rPr>
+    </w:lvl>
+  </w:abstractNum>
+  <w:abstractNum w:abstractNumId="1" w15:restartNumberingAfterBreak="0">
+    <w:nsid w:val="69B87D36"/>
+    <w:multiLevelType w:val="multilevel"/>
+    <w:tmpl w:val="BEDC75C2"/>
+    <w:lvl w:ilvl="0">
+      <w:start w:val="1"/>
+      <w:numFmt w:val="bullet"/>
+      <w:lvlText w:val=""/>
+      <w:lvlJc w:val="left"/>
+      <w:pPr>
+        <w:tabs>
+          <w:tab w:val="num" w:pos="720"/>
+        </w:tabs>
+        <w:ind w:left="720" w:hanging="360"/>
+      </w:pPr>
+      <w:rPr>
+        <w:rFonts w:ascii="Symbol" w:hAnsi="Symbol" w:hint="default"/>
+        <w:sz w:val="20"/>
+      </w:rPr>
+    </w:lvl>
+    <w:lvl w:ilvl="1" w:tentative="1">
+      <w:start w:val="1"/>
+      <w:numFmt w:val="bullet"/>
+      <w:lvlText w:val="o"/>
+      <w:lvlJc w:val="left"/>
+      <w:pPr>
+        <w:tabs>
+          <w:tab w:val="num" w:pos="1440"/>
+        </w:tabs>
+        <w:ind w:left="1440" w:hanging="360"/>
+      </w:pPr>
+      <w:rPr>
+        <w:rFonts w:ascii="Courier New" w:hAnsi="Courier New" w:hint="default"/>
+        <w:sz w:val="20"/>
+      </w:rPr>
+    </w:lvl>
+    <w:lvl w:ilvl="2" w:tentative="1">
+      <w:start w:val="1"/>
+      <w:numFmt w:val="bullet"/>
+      <w:lvlText w:val=""/>
+      <w:lvlJc w:val="left"/>
+      <w:pPr>
+        <w:tabs>
+          <w:tab w:val="num" w:pos="2160"/>
+        </w:tabs>
+        <w:ind w:left="2160" w:hanging="360"/>
+      </w:pPr>
+      <w:rPr>
+        <w:rFonts w:ascii="Wingdings" w:hAnsi="Wingdings" w:hint="default"/>
+        <w:sz w:val="20"/>
+      </w:rPr>
+    </w:lvl>
+    <w:lvl w:ilvl="3" w:tentative="1">
+      <w:start w:val="1"/>
+      <w:numFmt w:val="bullet"/>
+      <w:lvlText w:val=""/>
+      <w:lvlJc w:val="left"/>
+      <w:pPr>
+        <w:tabs>
+          <w:tab w:val="num" w:pos="2880"/>
+        </w:tabs>
+        <w:ind w:left="2880" w:hanging="360"/>
+      </w:pPr>
+      <w:rPr>
+        <w:rFonts w:ascii="Wingdings" w:hAnsi="Wingdings" w:hint="default"/>
+        <w:sz w:val="20"/>
+      </w:rPr>
+    </w:lvl>
+    <w:lvl w:ilvl="4" w:tentative="1">
+      <w:start w:val="1"/>
+      <w:numFmt w:val="bullet"/>
+      <w:lvlText w:val=""/>
+      <w:lvlJc w:val="left"/>
+      <w:pPr>
+        <w:tabs>
+          <w:tab w:val="num" w:pos="3600"/>
+        </w:tabs>
+        <w:ind w:left="3600" w:hanging="360"/>
+      </w:pPr>
+      <w:rPr>
+        <w:rFonts w:ascii="Wingdings" w:hAnsi="Wingdings" w:hint="default"/>
+        <w:sz w:val="20"/>
+      </w:rPr>
+    </w:lvl>
+    <w:lvl w:ilvl="5" w:tentative="1">
+      <w:start w:val="1"/>
+      <w:numFmt w:val="bullet"/>
+      <w:lvlText w:val=""/>
+      <w:lvlJc w:val="left"/>
+      <w:pPr>
+        <w:tabs>
+          <w:tab w:val="num" w:pos="4320"/>
+        </w:tabs>
+        <w:ind w:left="4320" w:hanging="360"/>
+      </w:pPr>
+      <w:rPr>
+        <w:rFonts w:ascii="Wingdings" w:hAnsi="Wingdings" w:hint="default"/>
+        <w:sz w:val="20"/>
+      </w:rPr>
+    </w:lvl>
+    <w:lvl w:ilvl="6" w:tentative="1">
+      <w:start w:val="1"/>
+      <w:numFmt w:val="bullet"/>
+      <w:lvlText w:val=""/>
+      <w:lvlJc w:val="left"/>
+      <w:pPr>
+        <w:tabs>
+          <w:tab w:val="num" w:pos="5040"/>
+        </w:tabs>
+        <w:ind w:left="5040" w:hanging="360"/>
+      </w:pPr>
+      <w:rPr>
+        <w:rFonts w:ascii="Wingdings" w:hAnsi="Wingdings" w:hint="default"/>
+        <w:sz w:val="20"/>
+      </w:rPr>
+    </w:lvl>
+    <w:lvl w:ilvl="7" w:tentative="1">
+      <w:start w:val="1"/>
+      <w:numFmt w:val="bullet"/>
+      <w:lvlText w:val=""/>
+      <w:lvlJc w:val="left"/>
+      <w:pPr>
+        <w:tabs>
+          <w:tab w:val="num" w:pos="5760"/>
+        </w:tabs>
+        <w:ind w:left="5760" w:hanging="360"/>
+      </w:pPr>
+      <w:rPr>
+        <w:rFonts w:ascii="Wingdings" w:hAnsi="Wingdings" w:hint="default"/>
+        <w:sz w:val="20"/>
+      </w:rPr>
+    </w:lvl>
+    <w:lvl w:ilvl="8" w:tentative="1">
+      <w:start w:val="1"/>
+      <w:numFmt w:val="bullet"/>
+      <w:lvlText w:val=""/>
+      <w:lvlJc w:val="left"/>
+      <w:pPr>
+        <w:tabs>
+          <w:tab w:val="num" w:pos="6480"/>
+        </w:tabs>
+        <w:ind w:left="6480" w:hanging="360"/>
+      </w:pPr>
+      <w:rPr>
+        <w:rFonts w:ascii="Wingdings" w:hAnsi="Wingdings" w:hint="default"/>
+        <w:sz w:val="20"/>
+      </w:rPr>
+    </w:lvl>
+  </w:abstractNum>
+  <w:num w:numId="1" w16cid:durableId="1305038900">
+    <w:abstractNumId w:val="0"/>
+  </w:num>
+  <w:num w:numId="2" w16cid:durableId="134808262">
+    <w:abstractNumId w:val="1"/>
+  </w:num>
+</w:numbering>
 </file>
 
 <file path=word/styles.xml><?xml version="1.0" encoding="utf-8"?>

</xml_diff>